<commit_message>
Add transaction form to console; clean up orphan graph nodes on delete; refresh dumps and report
</commit_message>
<xml_diff>
--- a/docs/TicketGuard_Review2_Progress_Report.docx
+++ b/docs/TicketGuard_Review2_Progress_Report.docx
@@ -2009,7 +2009,7 @@
           <w:b w:val="0"/>
           <w:i w:val="0"/>
         </w:rPr>
-        <w:t>The FastAPI service exposes 20 endpoints with automatic Swagger documentation at /docs (full list in the API documentation). A browser console at / shows summary counts, a colour-coded graph of detected rings, and a table of reasons.</w:t>
+        <w:t>The FastAPI service exposes 20 endpoints with automatic Swagger documentation at /docs (full list in the API documentation). A browser console at / has a form to add a transaction (saved to Cassandra, synced to Neo4j, detection re-run), summary counts, a colour-coded graph of detected rings, and a table of reasons.</w:t>
       </w:r>
     </w:p>
     <w:p>
@@ -2141,7 +2141,7 @@
               <w:rPr>
                 <w:sz w:val="20"/>
               </w:rPr>
-              <w:t>8,484 accounts, 46,132 tickets, 62 events, 50,000 transactions, 249,937 relationships (3,870 TRANSFERRED_TO)</w:t>
+              <w:t>8,480 accounts (incl. 1 platform account), 46,130 tickets, 60 events, 50,000 transactions, 249,931 relationships (3,870 TRANSFERRED_TO)</w:t>
             </w:r>
           </w:p>
         </w:tc>
@@ -2354,7 +2354,7 @@
               <w:rPr>
                 <w:sz w:val="20"/>
               </w:rPr>
-              <w:t>0.09s</w:t>
+              <w:t>0.1s</w:t>
             </w:r>
           </w:p>
         </w:tc>
@@ -2440,7 +2440,7 @@
               <w:rPr>
                 <w:sz w:val="20"/>
               </w:rPr>
-              <w:t>1.53s</w:t>
+              <w:t>1.99s</w:t>
             </w:r>
           </w:p>
         </w:tc>

</xml_diff>

<commit_message>
Add automatic background Cassandra-to-Neo4j sync; update docs and report
</commit_message>
<xml_diff>
--- a/docs/TicketGuard_Review2_Progress_Report.docx
+++ b/docs/TicketGuard_Review2_Progress_Report.docx
@@ -149,7 +149,7 @@
           <w:b w:val="0"/>
           <w:i w:val="0"/>
         </w:rPr>
-        <w:t>Review 1 finalised the problem, requirements, database choice, architecture and initial schema. Review 2 delivers the working prototype: both databases are implemented, populated with a 50,000-transaction synthetic dataset, synchronised, and exposed through a REST API. All four planned fraud detectors run on the Neo4j graph, and every finding carries a plain-language reason. The prototype is checked by 10 automated tests, all passing.</w:t>
+        <w:t>Review 1 finalised the problem, requirements, database choice, architecture and initial schema. Review 2 delivers the working prototype: both databases are implemented, populated with a 50,000-transaction synthetic dataset, synchronised, and exposed through a REST API. All four planned fraud detectors run on the Neo4j graph, and every finding carries a plain-language reason. The prototype is checked by 19 automated tests, all passing.</w:t>
       </w:r>
     </w:p>
     <w:tbl>
@@ -1737,7 +1737,7 @@
           <w:b w:val="0"/>
           <w:i w:val="0"/>
         </w:rPr>
-        <w:t>The sync module reads Cassandra day partitions from the stored watermark onwards and upserts them into Neo4j with MERGE, in batches of 2,000. It is idempotent: a second run reports zero new records. A full re-sync is available with full=true.</w:t>
+        <w:t>The sync module reads Cassandra day partitions from the stored watermark onwards and upserts them into Neo4j with MERGE, in batches of 2,000. It is idempotent: a second run reports zero new records. A full re-sync is available with full=true. A background worker repeats the sync automatically every 60 seconds (configurable, and it can be turned off), so new transactions reach the graph without a manual call.</w:t>
       </w:r>
     </w:p>
     <w:p>
@@ -2813,7 +2813,7 @@
           <w:b w:val="0"/>
           <w:i w:val="0"/>
         </w:rPr>
-        <w:t>Ten automated integration tests (pytest) run against the live databases and pass:</w:t>
+        <w:t>Nineteen automated integration tests (pytest) run against the live databases and pass:</w:t>
       </w:r>
     </w:p>
     <w:p>
@@ -2859,6 +2859,15 @@
       </w:pPr>
       <w:r>
         <w:t>Sync: a new transaction reaches the graph, a second sync is a no-op, deleting the transaction removes it from the graph.</w:t>
+      </w:r>
+    </w:p>
+    <w:p>
+      <w:pPr>
+        <w:pStyle w:val="ListBullet"/>
+        <w:spacing w:after="40"/>
+      </w:pPr>
+      <w:r>
+        <w:t>Extra tests for malformed input, unknown ids, result ordering, sync idempotency, detector parameters and the background sync.</w:t>
       </w:r>
     </w:p>
     <w:p>

</xml_diff>